<commit_message>
Update Shadow IT VM-approval doc to v1.1: reflect closed security state
Security controls (Sec 10), risk (Sec 11) and retirement plan (Sec 12) now
state the interim hardening completed on the current platform: anon revoked on
all personal-data and credential tables, RLS enforced, server-side sign in.
Corrected an inaccurate as-is claim: the service-role key is not in the client
bundle (verified). Remaining items (default PIN, column-level PIN read
restriction, plaintext PIN nulling, Vault) kept as tracked residuals.

Co-Authored-By: Claude Opus 4.8 <noreply@anthropic.com>
</commit_message>
<xml_diff>
--- a/Airtel_Champions_App_ShadowIT_VM_Approval.docx
+++ b/Airtel_Champions_App_ShadowIT_VM_Approval.docx
@@ -900,7 +900,7 @@
                 <w:color w:val="1A2233"/>
                 <w:sz w:val="18"/>
               </w:rPr>
-              <w:t>1.0</w:t>
+              <w:t>1.1</w:t>
             </w:r>
           </w:p>
         </w:tc>
@@ -1967,7 +1967,7 @@
                 <w:color w:val="1A2233"/>
                 <w:sz w:val="18"/>
               </w:rPr>
-              <w:t>Aug 2026</w:t>
+              <w:t>12 Aug 2026</w:t>
             </w:r>
           </w:p>
         </w:tc>
@@ -1995,6 +1995,96 @@
         <w:tc>
           <w:tcPr>
             <w:tcW w:type="dxa" w:w="1584"/>
+          </w:tcPr>
+          <w:p>
+            <w:pPr>
+              <w:spacing w:after="40" w:before="40"/>
+              <w:jc w:val="left"/>
+            </w:pPr>
+            <w:r/>
+            <w:r>
+              <w:rPr>
+                <w:rFonts w:ascii="Calibri" w:hAnsi="Calibri"/>
+                <w:b w:val="0"/>
+                <w:color w:val="1A2233"/>
+                <w:sz w:val="18"/>
+              </w:rPr>
+              <w:t>[Requestor]</w:t>
+            </w:r>
+          </w:p>
+        </w:tc>
+      </w:tr>
+      <w:tr>
+        <w:tc>
+          <w:tcPr>
+            <w:tcW w:type="dxa" w:w="720"/>
+            <w:shd w:val="clear" w:color="auto" w:fill="F2F5FB"/>
+          </w:tcPr>
+          <w:p>
+            <w:pPr>
+              <w:spacing w:after="40" w:before="40"/>
+              <w:jc w:val="left"/>
+            </w:pPr>
+            <w:r/>
+            <w:r>
+              <w:rPr>
+                <w:rFonts w:ascii="Calibri" w:hAnsi="Calibri"/>
+                <w:b w:val="0"/>
+                <w:color w:val="1A2233"/>
+                <w:sz w:val="18"/>
+              </w:rPr>
+              <w:t>1.1</w:t>
+            </w:r>
+          </w:p>
+        </w:tc>
+        <w:tc>
+          <w:tcPr>
+            <w:tcW w:type="dxa" w:w="1296"/>
+            <w:shd w:val="clear" w:color="auto" w:fill="F2F5FB"/>
+          </w:tcPr>
+          <w:p>
+            <w:pPr>
+              <w:spacing w:after="40" w:before="40"/>
+              <w:jc w:val="left"/>
+            </w:pPr>
+            <w:r/>
+            <w:r>
+              <w:rPr>
+                <w:rFonts w:ascii="Calibri" w:hAnsi="Calibri"/>
+                <w:b w:val="0"/>
+                <w:color w:val="1A2233"/>
+                <w:sz w:val="18"/>
+              </w:rPr>
+              <w:t>16 Aug 2026</w:t>
+            </w:r>
+          </w:p>
+        </w:tc>
+        <w:tc>
+          <w:tcPr>
+            <w:tcW w:type="dxa" w:w="5472"/>
+            <w:shd w:val="clear" w:color="auto" w:fill="F2F5FB"/>
+          </w:tcPr>
+          <w:p>
+            <w:pPr>
+              <w:spacing w:after="40" w:before="40"/>
+              <w:jc w:val="left"/>
+            </w:pPr>
+            <w:r/>
+            <w:r>
+              <w:rPr>
+                <w:rFonts w:ascii="Calibri" w:hAnsi="Calibri"/>
+                <w:b w:val="0"/>
+                <w:color w:val="1A2233"/>
+                <w:sz w:val="18"/>
+              </w:rPr>
+              <w:t>Updated security controls (Section 10), risk (Section 11) and retirement plan (Section 12) to reflect the interim hardening completed on the current platform: public anon key revoked on all personal-data and credential tables, RLS enforced, and server-side sign in. Corrected an as-is statement: the service-role key is not present in the client bundle.</w:t>
+            </w:r>
+          </w:p>
+        </w:tc>
+        <w:tc>
+          <w:tcPr>
+            <w:tcW w:type="dxa" w:w="1584"/>
+            <w:shd w:val="clear" w:color="auto" w:fill="F2F5FB"/>
           </w:tcPr>
           <w:p>
             <w:pPr>
@@ -13156,7 +13246,7 @@
                 <w:color w:val="1A2233"/>
                 <w:sz w:val="17"/>
               </w:rPr>
-              <w:t>Phone plus PIN; default PIN weakness; anon and service-role keys in client</w:t>
+              <w:t>Phone plus PIN; universal default PIN weakness; login formerly compared PINs in the browser via the public anon key</w:t>
             </w:r>
           </w:p>
         </w:tc>
@@ -13178,7 +13268,7 @@
                 <w:color w:val="1A2233"/>
                 <w:sz w:val="17"/>
               </w:rPr>
-              <w:t>RBAC retained and hardened; keys removed from client and held in Vault; enforce PIN policy; optional future SSO</w:t>
+              <w:t>Sign in runs server side and mints short lived authenticated tokens; only the public anon key is client side and it is inert for personal data; RBAC retained and hardened; enforce PIN policy; optional future SSO</w:t>
             </w:r>
           </w:p>
         </w:tc>
@@ -13222,7 +13312,7 @@
                 <w:color w:val="1A2233"/>
                 <w:sz w:val="17"/>
               </w:rPr>
-              <w:t>RLS defined but historically inconsistent</w:t>
+              <w:t>Previously off or inconsistent on credential tables (public read of plaintext PINs)</w:t>
             </w:r>
           </w:p>
         </w:tc>
@@ -13243,7 +13333,7 @@
                 <w:color w:val="1A2233"/>
                 <w:sz w:val="17"/>
               </w:rPr>
-              <w:t>RLS enforced; privileged writes only through SECURITY DEFINER RPCs</w:t>
+              <w:t>RLS enforced on all data tables; anon revoked; privileged writes only through service-role Edge Functions / SECURITY DEFINER RPCs</w:t>
             </w:r>
           </w:p>
         </w:tc>
@@ -13548,7 +13638,7 @@
                 <w:color w:val="1A2233"/>
                 <w:sz w:val="19"/>
               </w:rPr>
-              <w:t>Honest current-state note: the platform has known security gaps being remediated on a hardening branch, including a historic reliance on a universal default PIN (1234) with forced change disabled, and earlier inconsistent RLS enforcement. A zero-PII login redesign (blind-index login with the pepper held outside the database) has been shipped. These items must be closed as part of regularisation and are tracked in Section 12.</w:t>
+              <w:t>Current-state security note (updated 16 August 2026). The public read exposure identified in the privacy review has been closed on the current platform, ahead of the VM migration. The public anon key has been revoked on every table holding personal data or credentials (the sales user table, the identity store, the HBB installer, DSE and supervisor tables, the Airtel Money agent and HQ tables, and the ODU customer table); row level security is enabled with role scoped policies; and all sign in now runs server side in Edge Functions that mint short lived authenticated tokens, so the browser never reads a credential. This was verified from the attacker position: the anon key returns HTTP 401 on all of these tables, and a zero-PII blind-index login (with the pepper held outside the database) is in use. Remaining items to close, tracked in Section 12, are the universal default PIN (1234) with forced change disabled, restricting authenticated read of the residual plaintext PIN columns at column level, and nulling those columns once all users are on the blind-index store.</w:t>
             </w:r>
           </w:p>
         </w:tc>
@@ -13687,7 +13777,7 @@
                 <w:color w:val="1A2233"/>
                 <w:sz w:val="17"/>
               </w:rPr>
-              <w:t>PII and payment data on external SaaS; keys in client; no Airtel WAF</w:t>
+              <w:t>PII and payment data on external SaaS; no Airtel WAF (the public read of credential tables has been closed: anon revoked, RLS enforced, server-side sign in)</w:t>
             </w:r>
           </w:p>
         </w:tc>
@@ -14514,7 +14604,7 @@
                 <w:color w:val="1A2233"/>
                 <w:sz w:val="17"/>
               </w:rPr>
-              <w:t>Close PIN / default-credential gaps; enforce RLS; move keys to Vault; enable audit and backup</w:t>
+              <w:t>Interim on current platform already done: anon revoked on all credential/PII tables, RLS enforced, server-side sign in. Remaining: enforce PIN policy and retire default PIN; column-level restriction and nulling of residual plaintext PINs; move keys to Vault; enable audit and backup</w:t>
             </w:r>
           </w:p>
         </w:tc>

</xml_diff>